<commit_message>
feat(content): sync workspace updates and cover pipeline
</commit_message>
<xml_diff>
--- a/deliverables/course_library_v3/00_AI课程资料库v3总目录.docx
+++ b/deliverables/course_library_v3/00_AI课程资料库v3总目录.docx
@@ -836,6 +836,286 @@
     </w:p>
     <w:p>
       <w:pPr>
+        <w:pStyle w:val="ListBullet"/>
+      </w:pPr>
+      <w:r>
+        <w:rPr>
+          <w:rFonts w:ascii="Calibri" w:hAnsi="Calibri" w:eastAsia="Calibri"/>
+          <w:b w:val="0"/>
+          <w:color w:val="222C3D"/>
+          <w:sz w:val="22"/>
+        </w:rPr>
+        <w:t>12_SOP标准操作课：01_选题SOP怎么写</w:t>
+      </w:r>
+    </w:p>
+    <w:p>
+      <w:pPr>
+        <w:pStyle w:val="ListBullet"/>
+      </w:pPr>
+      <w:r>
+        <w:rPr>
+          <w:rFonts w:ascii="Calibri" w:hAnsi="Calibri" w:eastAsia="Calibri"/>
+          <w:b w:val="0"/>
+          <w:color w:val="222C3D"/>
+          <w:sz w:val="22"/>
+        </w:rPr>
+        <w:t>12_SOP标准操作课：02_长文写作SOP</w:t>
+      </w:r>
+    </w:p>
+    <w:p>
+      <w:pPr>
+        <w:pStyle w:val="ListBullet"/>
+      </w:pPr>
+      <w:r>
+        <w:rPr>
+          <w:rFonts w:ascii="Calibri" w:hAnsi="Calibri" w:eastAsia="Calibri"/>
+          <w:b w:val="0"/>
+          <w:color w:val="222C3D"/>
+          <w:sz w:val="22"/>
+        </w:rPr>
+        <w:t>12_SOP标准操作课：03_私域资料包SOP</w:t>
+      </w:r>
+    </w:p>
+    <w:p>
+      <w:pPr>
+        <w:pStyle w:val="ListBullet"/>
+      </w:pPr>
+      <w:r>
+        <w:rPr>
+          <w:rFonts w:ascii="Calibri" w:hAnsi="Calibri" w:eastAsia="Calibri"/>
+          <w:b w:val="0"/>
+          <w:color w:val="222C3D"/>
+          <w:sz w:val="22"/>
+        </w:rPr>
+        <w:t>12_SOP标准操作课：04_训练营开营SOP</w:t>
+      </w:r>
+    </w:p>
+    <w:p>
+      <w:pPr>
+        <w:pStyle w:val="ListBullet"/>
+      </w:pPr>
+      <w:r>
+        <w:rPr>
+          <w:rFonts w:ascii="Calibri" w:hAnsi="Calibri" w:eastAsia="Calibri"/>
+          <w:b w:val="0"/>
+          <w:color w:val="222C3D"/>
+          <w:sz w:val="22"/>
+        </w:rPr>
+        <w:t>12_SOP标准操作课：05_复盘优化SOP</w:t>
+      </w:r>
+    </w:p>
+    <w:p>
+      <w:pPr>
+        <w:pStyle w:val="ListBullet"/>
+      </w:pPr>
+      <w:r>
+        <w:rPr>
+          <w:rFonts w:ascii="Calibri" w:hAnsi="Calibri" w:eastAsia="Calibri"/>
+          <w:b w:val="0"/>
+          <w:color w:val="222C3D"/>
+          <w:sz w:val="22"/>
+        </w:rPr>
+        <w:t>13_Workflow设计课：01_从任务到Workflow</w:t>
+      </w:r>
+    </w:p>
+    <w:p>
+      <w:pPr>
+        <w:pStyle w:val="ListBullet"/>
+      </w:pPr>
+      <w:r>
+        <w:rPr>
+          <w:rFonts w:ascii="Calibri" w:hAnsi="Calibri" w:eastAsia="Calibri"/>
+          <w:b w:val="0"/>
+          <w:color w:val="222C3D"/>
+          <w:sz w:val="22"/>
+        </w:rPr>
+        <w:t>13_Workflow设计课：02_内容生产Workflow</w:t>
+      </w:r>
+    </w:p>
+    <w:p>
+      <w:pPr>
+        <w:pStyle w:val="ListBullet"/>
+      </w:pPr>
+      <w:r>
+        <w:rPr>
+          <w:rFonts w:ascii="Calibri" w:hAnsi="Calibri" w:eastAsia="Calibri"/>
+          <w:b w:val="0"/>
+          <w:color w:val="222C3D"/>
+          <w:sz w:val="22"/>
+        </w:rPr>
+        <w:t>13_Workflow设计课：03_私域承接Workflow</w:t>
+      </w:r>
+    </w:p>
+    <w:p>
+      <w:pPr>
+        <w:pStyle w:val="ListBullet"/>
+      </w:pPr>
+      <w:r>
+        <w:rPr>
+          <w:rFonts w:ascii="Calibri" w:hAnsi="Calibri" w:eastAsia="Calibri"/>
+          <w:b w:val="0"/>
+          <w:color w:val="222C3D"/>
+          <w:sz w:val="22"/>
+        </w:rPr>
+        <w:t>13_Workflow设计课：04_训练营交付Workflow</w:t>
+      </w:r>
+    </w:p>
+    <w:p>
+      <w:pPr>
+        <w:pStyle w:val="ListBullet"/>
+      </w:pPr>
+      <w:r>
+        <w:rPr>
+          <w:rFonts w:ascii="Calibri" w:hAnsi="Calibri" w:eastAsia="Calibri"/>
+          <w:b w:val="0"/>
+          <w:color w:val="222C3D"/>
+          <w:sz w:val="22"/>
+        </w:rPr>
+        <w:t>13_Workflow设计课：05_多人协作Workflow</w:t>
+      </w:r>
+    </w:p>
+    <w:p>
+      <w:pPr>
+        <w:pStyle w:val="ListBullet"/>
+      </w:pPr>
+      <w:r>
+        <w:rPr>
+          <w:rFonts w:ascii="Calibri" w:hAnsi="Calibri" w:eastAsia="Calibri"/>
+          <w:b w:val="0"/>
+          <w:color w:val="222C3D"/>
+          <w:sz w:val="22"/>
+        </w:rPr>
+        <w:t>14_MCP与工具接入课：01_MCP到底是什么</w:t>
+      </w:r>
+    </w:p>
+    <w:p>
+      <w:pPr>
+        <w:pStyle w:val="ListBullet"/>
+      </w:pPr>
+      <w:r>
+        <w:rPr>
+          <w:rFonts w:ascii="Calibri" w:hAnsi="Calibri" w:eastAsia="Calibri"/>
+          <w:b w:val="0"/>
+          <w:color w:val="222C3D"/>
+          <w:sz w:val="22"/>
+        </w:rPr>
+        <w:t>14_MCP与工具接入课：02_怎么接浏览器与文档能力</w:t>
+      </w:r>
+    </w:p>
+    <w:p>
+      <w:pPr>
+        <w:pStyle w:val="ListBullet"/>
+      </w:pPr>
+      <w:r>
+        <w:rPr>
+          <w:rFonts w:ascii="Calibri" w:hAnsi="Calibri" w:eastAsia="Calibri"/>
+          <w:b w:val="0"/>
+          <w:color w:val="222C3D"/>
+          <w:sz w:val="22"/>
+        </w:rPr>
+        <w:t>14_MCP与工具接入课：03_MCP配置案例</w:t>
+      </w:r>
+    </w:p>
+    <w:p>
+      <w:pPr>
+        <w:pStyle w:val="ListBullet"/>
+      </w:pPr>
+      <w:r>
+        <w:rPr>
+          <w:rFonts w:ascii="Calibri" w:hAnsi="Calibri" w:eastAsia="Calibri"/>
+          <w:b w:val="0"/>
+          <w:color w:val="222C3D"/>
+          <w:sz w:val="22"/>
+        </w:rPr>
+        <w:t>14_MCP与工具接入课：04_MCP常见报错排查</w:t>
+      </w:r>
+    </w:p>
+    <w:p>
+      <w:pPr>
+        <w:pStyle w:val="ListBullet"/>
+      </w:pPr>
+      <w:r>
+        <w:rPr>
+          <w:rFonts w:ascii="Calibri" w:hAnsi="Calibri" w:eastAsia="Calibri"/>
+          <w:b w:val="0"/>
+          <w:color w:val="222C3D"/>
+          <w:sz w:val="22"/>
+        </w:rPr>
+        <w:t>14_MCP与工具接入课：05_MCP能接进哪些业务</w:t>
+      </w:r>
+    </w:p>
+    <w:p>
+      <w:pPr>
+        <w:pStyle w:val="ListBullet"/>
+      </w:pPr>
+      <w:r>
+        <w:rPr>
+          <w:rFonts w:ascii="Calibri" w:hAnsi="Calibri" w:eastAsia="Calibri"/>
+          <w:b w:val="0"/>
+          <w:color w:val="222C3D"/>
+          <w:sz w:val="22"/>
+        </w:rPr>
+        <w:t>15_交付与排错实战课：01_为什么做了很多还是交付不出来</w:t>
+      </w:r>
+    </w:p>
+    <w:p>
+      <w:pPr>
+        <w:pStyle w:val="ListBullet"/>
+      </w:pPr>
+      <w:r>
+        <w:rPr>
+          <w:rFonts w:ascii="Calibri" w:hAnsi="Calibri" w:eastAsia="Calibri"/>
+          <w:b w:val="0"/>
+          <w:color w:val="222C3D"/>
+          <w:sz w:val="22"/>
+        </w:rPr>
+        <w:t>15_交付与排错实战课：02_怎么改成自己的版本</w:t>
+      </w:r>
+    </w:p>
+    <w:p>
+      <w:pPr>
+        <w:pStyle w:val="ListBullet"/>
+      </w:pPr>
+      <w:r>
+        <w:rPr>
+          <w:rFonts w:ascii="Calibri" w:hAnsi="Calibri" w:eastAsia="Calibri"/>
+          <w:b w:val="0"/>
+          <w:color w:val="222C3D"/>
+          <w:sz w:val="22"/>
+        </w:rPr>
+        <w:t>15_交付与排错实战课：03_常见故障排查方法</w:t>
+      </w:r>
+    </w:p>
+    <w:p>
+      <w:pPr>
+        <w:pStyle w:val="ListBullet"/>
+      </w:pPr>
+      <w:r>
+        <w:rPr>
+          <w:rFonts w:ascii="Calibri" w:hAnsi="Calibri" w:eastAsia="Calibri"/>
+          <w:b w:val="0"/>
+          <w:color w:val="222C3D"/>
+          <w:sz w:val="22"/>
+        </w:rPr>
+        <w:t>15_交付与排错实战课：04_怎么给客户交付</w:t>
+      </w:r>
+    </w:p>
+    <w:p>
+      <w:pPr>
+        <w:pStyle w:val="ListBullet"/>
+      </w:pPr>
+      <w:r>
+        <w:rPr>
+          <w:rFonts w:ascii="Calibri" w:hAnsi="Calibri" w:eastAsia="Calibri"/>
+          <w:b w:val="0"/>
+          <w:color w:val="222C3D"/>
+          <w:sz w:val="22"/>
+        </w:rPr>
+        <w:t>15_交付与排错实战课：05_怎么把一套资料持续迭代</w:t>
+      </w:r>
+    </w:p>
+    <w:p>
+      <w:pPr>
         <w:pStyle w:val="Heading1"/>
       </w:pPr>
       <w:r>

</xml_diff>